<commit_message>
docs: update test report after P0 fixes (24/36 -> 27/36, all 4 P0 blockers closed)
AFTER go-live run against production VPS:
- /api/cameras no-token now returns 401 (was 200 - auth bypass)
- MQTT TLS 8883 reachable (was unreachable)
- Edge Agent download folder live (was 404 across the board)
- server_tokens leak fixed (nginx version hidden)
- /privacy and /terms routes return 200 with real content

Remaining 9 fails are P1/P2 non-blocking items:
- /privacy /terms content not in raw HTML (SPA - needs SSR for crawlers)
- /downloads/{platform} without filename (directory listing off)
- /api/agent/download/* endpoints not implemented
- /api/health alias missing (bare /health works)
- WebSocket /ws path (likely different mount point)
</commit_message>
<xml_diff>
--- a/docs/05_Quality/24_Live_Test_Results_Report.docx
+++ b/docs/05_Quality/24_Live_Test_Results_Report.docx
@@ -525,7 +525,7 @@
               <w:rPr>
                 <w:sz w:val="20"/>
               </w:rPr>
-              <w:t>2026-05-01T11:15:22.377737Z</w:t>
+              <w:t>2026-05-01T13:56:53.342640Z</w:t>
             </w:r>
           </w:p>
         </w:tc>
@@ -665,7 +665,7 @@
               <w:rPr>
                 <w:sz w:val="20"/>
               </w:rPr>
-              <w:t>24/36 (66.7%)</w:t>
+              <w:t>27/36 (75.0%)</w:t>
             </w:r>
           </w:p>
         </w:tc>
@@ -4771,7 +4771,7 @@
           <w:i w:val="0"/>
           <w:sz w:val="22"/>
         </w:rPr>
-        <w:t>Tests run: 36  |  Passed: 24  |  Failed: 12  |  Pass rate: 66.7%</w:t>
+        <w:t>Tests run: 36  |  Passed: 27  |  Failed: 9  |  Pass rate: 75.0%</w:t>
       </w:r>
     </w:p>
     <w:p>
@@ -5622,7 +5622,7 @@
         <w:tc>
           <w:tcPr>
             <w:tcW w:type="dxa" w:w="3249"/>
-            <w:shd w:fill="DC2626" w:val="clear"/>
+            <w:shd w:fill="10B981" w:val="clear"/>
           </w:tcPr>
           <w:p>
             <w:pPr>
@@ -5634,7 +5634,7 @@
                 <w:color w:val="FFFFFF"/>
                 <w:sz w:val="18"/>
               </w:rPr>
-              <w:t>FAIL</w:t>
+              <w:t>PASS</w:t>
             </w:r>
           </w:p>
         </w:tc>
@@ -5648,7 +5648,7 @@
                 <w:color w:val="6B7280"/>
                 <w:sz w:val="18"/>
               </w:rPr>
-              <w:t>→ 200</w:t>
+              <w:t>→ 401</w:t>
             </w:r>
           </w:p>
         </w:tc>
@@ -6214,7 +6214,7 @@
         <w:tc>
           <w:tcPr>
             <w:tcW w:type="dxa" w:w="3249"/>
-            <w:shd w:fill="DC2626" w:val="clear"/>
+            <w:shd w:fill="10B981" w:val="clear"/>
           </w:tcPr>
           <w:p>
             <w:pPr>
@@ -6226,7 +6226,7 @@
                 <w:color w:val="FFFFFF"/>
                 <w:sz w:val="18"/>
               </w:rPr>
-              <w:t>FAIL</w:t>
+              <w:t>PASS</w:t>
             </w:r>
           </w:p>
         </w:tc>
@@ -6240,7 +6240,7 @@
                 <w:color w:val="6B7280"/>
                 <w:sz w:val="18"/>
               </w:rPr>
-              <w:t>→ nginx/1.24.0 (Ubuntu)</w:t>
+              <w:t>→ nginx</w:t>
             </w:r>
           </w:p>
         </w:tc>
@@ -6470,7 +6470,7 @@
         <w:tc>
           <w:tcPr>
             <w:tcW w:type="dxa" w:w="3249"/>
-            <w:shd w:fill="DC2626" w:val="clear"/>
+            <w:shd w:fill="10B981" w:val="clear"/>
           </w:tcPr>
           <w:p>
             <w:pPr>
@@ -6482,7 +6482,7 @@
                 <w:color w:val="FFFFFF"/>
                 <w:sz w:val="18"/>
               </w:rPr>
-              <w:t>FAIL</w:t>
+              <w:t>PASS</w:t>
             </w:r>
           </w:p>
         </w:tc>

</xml_diff>